<commit_message>
register tugas prak 3
</commit_message>
<xml_diff>
--- a/Jobsheet 7/10_Kartika Tri Juliana_JS 07_ Authentication dan Authorization.docx
+++ b/Jobsheet 7/10_Kartika Tri Juliana_JS 07_ Authentication dan Authorization.docx
@@ -4545,7 +4545,7 @@
               </wp:anchor>
             </w:drawing>
           </mc:Choice>
-          <mc:Fallback xmlns:pic="http://schemas.openxmlformats.org/drawingml/2006/picture" xmlns:a="http://schemas.openxmlformats.org/drawingml/2006/main" xmlns:ve="http://schemas.openxmlformats.org/markup-compatibility/2006">
+          <mc:Fallback xmlns:ve="http://schemas.openxmlformats.org/markup-compatibility/2006" xmlns:a="http://schemas.openxmlformats.org/drawingml/2006/main" xmlns:pic="http://schemas.openxmlformats.org/drawingml/2006/picture">
             <w:pict>
               <v:group style="position:absolute;margin-left:107.095001pt;margin-top:416.045013pt;width:455pt;height:306.650pt;mso-position-horizontal-relative:page;mso-position-vertical-relative:page;z-index:15731200" id="docshapegroup8" coordorigin="2142,8321" coordsize="9100,6133">
                 <v:shape style="position:absolute;left:2233;top:8374;width:8719;height:6027" type="#_x0000_t75" id="docshape9" stroked="false">
@@ -5244,7 +5244,7 @@
               </wp:anchor>
             </w:drawing>
           </mc:Choice>
-          <mc:Fallback xmlns:pic="http://schemas.openxmlformats.org/drawingml/2006/picture" xmlns:a="http://schemas.openxmlformats.org/drawingml/2006/main" xmlns:ve="http://schemas.openxmlformats.org/markup-compatibility/2006">
+          <mc:Fallback xmlns:ve="http://schemas.openxmlformats.org/markup-compatibility/2006" xmlns:a="http://schemas.openxmlformats.org/drawingml/2006/main" xmlns:pic="http://schemas.openxmlformats.org/drawingml/2006/picture">
             <w:pict>
               <v:group style="position:absolute;margin-left:107.095001pt;margin-top:4.059187pt;width:313.25pt;height:77.45pt;mso-position-horizontal-relative:page;mso-position-vertical-relative:paragraph;z-index:-15727104;mso-wrap-distance-left:0;mso-wrap-distance-right:0" id="docshapegroup15" coordorigin="2142,81" coordsize="6265,1549">
                 <v:shape style="position:absolute;left:2236;top:96;width:5839;height:1519" type="#_x0000_t75" id="docshape16" stroked="false">
@@ -5511,7 +5511,7 @@
               </wp:anchor>
             </w:drawing>
           </mc:Choice>
-          <mc:Fallback xmlns:pic="http://schemas.openxmlformats.org/drawingml/2006/picture" xmlns:a="http://schemas.openxmlformats.org/drawingml/2006/main" xmlns:ve="http://schemas.openxmlformats.org/markup-compatibility/2006">
+          <mc:Fallback xmlns:ve="http://schemas.openxmlformats.org/markup-compatibility/2006" xmlns:a="http://schemas.openxmlformats.org/drawingml/2006/main" xmlns:pic="http://schemas.openxmlformats.org/drawingml/2006/picture">
             <w:pict>
               <v:group style="position:absolute;margin-left:107.095001pt;margin-top:4.781172pt;width:313.25pt;height:77.45pt;mso-position-horizontal-relative:page;mso-position-vertical-relative:paragraph;z-index:-15726592;mso-wrap-distance-left:0;mso-wrap-distance-right:0" id="docshapegroup18" coordorigin="2142,96" coordsize="6265,1549">
                 <v:shape style="position:absolute;left:2231;top:110;width:6003;height:1519" type="#_x0000_t75" id="docshape19" stroked="false">
@@ -26007,6 +26007,7 @@
       </w:pPr>
       <w:r>
         <w:rPr>
+          <w:noProof/>
           <w:sz w:val="24"/>
         </w:rPr>
         <w:drawing>
@@ -26079,6 +26080,7 @@
       </w:pPr>
       <w:r>
         <w:rPr>
+          <w:noProof/>
           <w:sz w:val="24"/>
         </w:rPr>
         <w:drawing>
@@ -26151,6 +26153,7 @@
       </w:pPr>
       <w:r>
         <w:rPr>
+          <w:noProof/>
           <w:sz w:val="24"/>
         </w:rPr>
         <w:drawing>
@@ -26223,6 +26226,7 @@
       </w:pPr>
       <w:r>
         <w:rPr>
+          <w:noProof/>
           <w:sz w:val="24"/>
         </w:rPr>
         <w:drawing>
@@ -26296,6 +26300,7 @@
       </w:pPr>
       <w:r>
         <w:rPr>
+          <w:noProof/>
           <w:sz w:val="24"/>
         </w:rPr>
         <w:drawing>
@@ -26347,8 +26352,6 @@
         </w:rPr>
         <w:br w:type="page"/>
       </w:r>
-      <w:bookmarkStart w:id="0" w:name="_GoBack"/>
-      <w:bookmarkEnd w:id="0"/>
     </w:p>
     <w:p>
       <w:pPr>
@@ -26365,6 +26368,7 @@
       </w:pPr>
       <w:r>
         <w:rPr>
+          <w:noProof/>
           <w:sz w:val="24"/>
         </w:rPr>
         <w:lastRenderedPageBreak/>
@@ -26439,6 +26443,7 @@
       </w:pPr>
       <w:r>
         <w:rPr>
+          <w:noProof/>
           <w:sz w:val="24"/>
         </w:rPr>
         <w:drawing>
@@ -28115,7 +28120,7 @@
               </wp:anchor>
             </w:drawing>
           </mc:Choice>
-          <mc:Fallback xmlns:pic="http://schemas.openxmlformats.org/drawingml/2006/picture" xmlns:a="http://schemas.openxmlformats.org/drawingml/2006/main" xmlns:ve="http://schemas.openxmlformats.org/markup-compatibility/2006">
+          <mc:Fallback xmlns:ve="http://schemas.openxmlformats.org/markup-compatibility/2006" xmlns:a="http://schemas.openxmlformats.org/drawingml/2006/main" xmlns:pic="http://schemas.openxmlformats.org/drawingml/2006/picture">
             <w:pict>
               <v:group style="position:absolute;margin-left:107.095001pt;margin-top:4.599756pt;width:286.4pt;height:214.8pt;mso-position-horizontal-relative:page;mso-position-vertical-relative:paragraph;z-index:-15720960;mso-wrap-distance-left:0;mso-wrap-distance-right:0" id="docshapegroup40" coordorigin="2142,92" coordsize="5728,4296">
                 <v:shape style="position:absolute;left:2293;top:171;width:5264;height:4161" type="#_x0000_t75" id="docshape41" stroked="false">
@@ -29024,7 +29029,7 @@
               </wp:inline>
             </w:drawing>
           </mc:Choice>
-          <mc:Fallback xmlns:pic="http://schemas.openxmlformats.org/drawingml/2006/picture" xmlns:a="http://schemas.openxmlformats.org/drawingml/2006/main" xmlns:ve="http://schemas.openxmlformats.org/markup-compatibility/2006">
+          <mc:Fallback xmlns:ve="http://schemas.openxmlformats.org/markup-compatibility/2006" xmlns:a="http://schemas.openxmlformats.org/drawingml/2006/main" xmlns:pic="http://schemas.openxmlformats.org/drawingml/2006/picture">
             <w:pict>
               <v:group style="width:412.45pt;height:252.05pt;mso-position-horizontal-relative:char;mso-position-vertical-relative:line" id="docshapegroup44" coordorigin="0,0" coordsize="8249,5041">
                 <v:shape style="position:absolute;left:30;top:46;width:8197;height:4980" type="#_x0000_t75" id="docshape45" stroked="false">
@@ -29307,7 +29312,7 @@
               </wp:anchor>
             </w:drawing>
           </mc:Choice>
-          <mc:Fallback xmlns:pic="http://schemas.openxmlformats.org/drawingml/2006/picture" xmlns:a="http://schemas.openxmlformats.org/drawingml/2006/main" xmlns:ve="http://schemas.openxmlformats.org/markup-compatibility/2006">
+          <mc:Fallback xmlns:ve="http://schemas.openxmlformats.org/markup-compatibility/2006" xmlns:a="http://schemas.openxmlformats.org/drawingml/2006/main" xmlns:pic="http://schemas.openxmlformats.org/drawingml/2006/picture">
             <w:pict>
               <v:group style="position:absolute;margin-left:107.095001pt;margin-top:4.356172pt;width:412.5pt;height:63.2pt;mso-position-horizontal-relative:page;mso-position-vertical-relative:paragraph;z-index:-15719424;mso-wrap-distance-left:0;mso-wrap-distance-right:0" id="docshapegroup47" coordorigin="2142,87" coordsize="8250,1264">
                 <v:shape style="position:absolute;left:2222;top:102;width:7935;height:1234" type="#_x0000_t75" id="docshape48" stroked="false">
@@ -29785,7 +29790,7 @@
               </wp:inline>
             </w:drawing>
           </mc:Choice>
-          <mc:Fallback xmlns:pic="http://schemas.openxmlformats.org/drawingml/2006/picture" xmlns:a="http://schemas.openxmlformats.org/drawingml/2006/main" xmlns:ve="http://schemas.openxmlformats.org/markup-compatibility/2006">
+          <mc:Fallback xmlns:ve="http://schemas.openxmlformats.org/markup-compatibility/2006" xmlns:a="http://schemas.openxmlformats.org/drawingml/2006/main" xmlns:pic="http://schemas.openxmlformats.org/drawingml/2006/picture">
             <w:pict>
               <v:group style="width:417.85pt;height:155.35pt;mso-position-horizontal-relative:char;mso-position-vertical-relative:line" id="docshapegroup53" coordorigin="0,0" coordsize="8357,3107">
                 <v:shape style="position:absolute;left:181;top:74;width:8054;height:3018" type="#_x0000_t75" id="docshape54" stroked="false">
@@ -30671,21 +30676,7 @@
           <w:spacing w:val="-2"/>
           <w:sz w:val="24"/>
         </w:rPr>
-        <w:t xml:space="preserve">Memodifikasi </w:t>
-      </w:r>
-      <w:r>
-        <w:rPr>
-          <w:spacing w:val="-2"/>
-          <w:sz w:val="24"/>
-        </w:rPr>
-        <w:t>AuthorizeUser.php</w:t>
-      </w:r>
-      <w:r>
-        <w:rPr>
-          <w:spacing w:val="-2"/>
-          <w:sz w:val="24"/>
-        </w:rPr>
-        <w:t xml:space="preserve"> untuk pengguna bisa memiliki akses di role tertentu</w:t>
+        <w:t>Memodifikasi AuthorizeUser.php untuk pengguna bisa memiliki akses di role tertentu</w:t>
       </w:r>
     </w:p>
     <w:p>
@@ -31202,7 +31193,7 @@
               </wp:anchor>
             </w:drawing>
           </mc:Choice>
-          <mc:Fallback xmlns:pic="http://schemas.openxmlformats.org/drawingml/2006/picture" xmlns:a="http://schemas.openxmlformats.org/drawingml/2006/main" xmlns:ve="http://schemas.openxmlformats.org/markup-compatibility/2006">
+          <mc:Fallback xmlns:ve="http://schemas.openxmlformats.org/markup-compatibility/2006" xmlns:a="http://schemas.openxmlformats.org/drawingml/2006/main" xmlns:pic="http://schemas.openxmlformats.org/drawingml/2006/picture">
             <w:pict>
               <v:group style="position:absolute;margin-left:71.650002pt;margin-top:18.448936pt;width:455pt;height:228.95pt;mso-position-horizontal-relative:page;mso-position-vertical-relative:paragraph;z-index:-15717376;mso-wrap-distance-left:0;mso-wrap-distance-right:0" id="docshapegroup60" coordorigin="1433,369" coordsize="9100,4579">
                 <v:shape style="position:absolute;left:1502;top:459;width:8845;height:4420" type="#_x0000_t75" id="docshape61" stroked="false">
@@ -31925,7 +31916,7 @@
               </wp:inline>
             </w:drawing>
           </mc:Choice>
-          <mc:Fallback xmlns:pic="http://schemas.openxmlformats.org/drawingml/2006/picture" xmlns:a="http://schemas.openxmlformats.org/drawingml/2006/main" xmlns:ve="http://schemas.openxmlformats.org/markup-compatibility/2006">
+          <mc:Fallback xmlns:ve="http://schemas.openxmlformats.org/markup-compatibility/2006" xmlns:a="http://schemas.openxmlformats.org/drawingml/2006/main" xmlns:pic="http://schemas.openxmlformats.org/drawingml/2006/picture">
             <w:pict>
               <v:group style="width:207pt;height:211.45pt;mso-position-horizontal-relative:char;mso-position-vertical-relative:line" id="docshapegroup67" coordorigin="0,0" coordsize="4140,4229">
                 <v:shape style="position:absolute;left:180;top:59;width:3295;height:4110" type="#_x0000_t75" id="docshape68" stroked="false">
@@ -32180,7 +32171,7 @@
               </wp:anchor>
             </w:drawing>
           </mc:Choice>
-          <mc:Fallback xmlns:pic="http://schemas.openxmlformats.org/drawingml/2006/picture" xmlns:a="http://schemas.openxmlformats.org/drawingml/2006/main" xmlns:ve="http://schemas.openxmlformats.org/markup-compatibility/2006">
+          <mc:Fallback xmlns:ve="http://schemas.openxmlformats.org/markup-compatibility/2006" xmlns:a="http://schemas.openxmlformats.org/drawingml/2006/main" xmlns:pic="http://schemas.openxmlformats.org/drawingml/2006/picture">
             <w:pict>
               <v:group style="position:absolute;margin-left:107.095001pt;margin-top:4.506172pt;width:417.6pt;height:241.25pt;mso-position-horizontal-relative:page;mso-position-vertical-relative:paragraph;z-index:-15715840;mso-wrap-distance-left:0;mso-wrap-distance-right:0" id="docshapegroup70" coordorigin="2142,90" coordsize="8352,4825">
                 <v:shape style="position:absolute;left:2206;top:105;width:8273;height:4795" type="#_x0000_t75" id="docshape71" stroked="false">
@@ -32481,7 +32472,7 @@
               </wp:inline>
             </w:drawing>
           </mc:Choice>
-          <mc:Fallback xmlns:pic="http://schemas.openxmlformats.org/drawingml/2006/picture" xmlns:a="http://schemas.openxmlformats.org/drawingml/2006/main" xmlns:ve="http://schemas.openxmlformats.org/markup-compatibility/2006">
+          <mc:Fallback xmlns:ve="http://schemas.openxmlformats.org/markup-compatibility/2006" xmlns:a="http://schemas.openxmlformats.org/drawingml/2006/main" xmlns:pic="http://schemas.openxmlformats.org/drawingml/2006/picture">
             <w:pict>
               <v:group style="width:417.6pt;height:119.95pt;mso-position-horizontal-relative:char;mso-position-vertical-relative:line" id="docshapegroup73" coordorigin="0,0" coordsize="8352,2399">
                 <v:shape style="position:absolute;left:62;top:96;width:8241;height:2251" type="#_x0000_t75" id="docshape74" stroked="false">
@@ -33425,6 +33416,89 @@
     <w:p>
       <w:pPr>
         <w:pStyle w:val="ListParagraph"/>
+        <w:tabs>
+          <w:tab w:val="left" w:pos="867"/>
+        </w:tabs>
+        <w:spacing w:before="86"/>
+        <w:ind w:left="867" w:firstLine="0"/>
+        <w:rPr>
+          <w:spacing w:val="-2"/>
+          <w:sz w:val="24"/>
+        </w:rPr>
+      </w:pPr>
+      <w:r>
+        <w:rPr>
+          <w:spacing w:val="-2"/>
+          <w:sz w:val="24"/>
+        </w:rPr>
+        <w:t>= - agar bisa mendapatkan level_kode dari user untuk login maka dilakukan modifikasi usermodel</w:t>
+      </w:r>
+    </w:p>
+    <w:p>
+      <w:pPr>
+        <w:pStyle w:val="ListParagraph"/>
+        <w:numPr>
+          <w:ilvl w:val="0"/>
+          <w:numId w:val="6"/>
+        </w:numPr>
+        <w:tabs>
+          <w:tab w:val="left" w:pos="867"/>
+        </w:tabs>
+        <w:spacing w:before="86"/>
+        <w:rPr>
+          <w:sz w:val="24"/>
+        </w:rPr>
+      </w:pPr>
+      <w:r>
+        <w:rPr>
+          <w:spacing w:val="-2"/>
+          <w:sz w:val="24"/>
+        </w:rPr>
+        <w:t>Untuk mengecek level_kode maka di modifikasi middleware</w:t>
+      </w:r>
+    </w:p>
+    <w:p>
+      <w:pPr>
+        <w:pStyle w:val="ListParagraph"/>
+        <w:numPr>
+          <w:ilvl w:val="0"/>
+          <w:numId w:val="6"/>
+        </w:numPr>
+        <w:tabs>
+          <w:tab w:val="left" w:pos="867"/>
+        </w:tabs>
+        <w:spacing w:before="86"/>
+        <w:rPr>
+          <w:spacing w:val="-2"/>
+          <w:sz w:val="24"/>
+        </w:rPr>
+      </w:pPr>
+      <w:r>
+        <w:rPr>
+          <w:spacing w:val="-2"/>
+          <w:sz w:val="24"/>
+        </w:rPr>
+        <w:t>Modifikasikan route ntuk memisahkan role yang memiliki hak akses</w:t>
+      </w:r>
+    </w:p>
+    <w:p>
+      <w:pPr>
+        <w:rPr>
+          <w:spacing w:val="-2"/>
+          <w:sz w:val="24"/>
+        </w:rPr>
+      </w:pPr>
+      <w:r>
+        <w:rPr>
+          <w:spacing w:val="-2"/>
+          <w:sz w:val="24"/>
+        </w:rPr>
+        <w:br w:type="page"/>
+      </w:r>
+    </w:p>
+    <w:p>
+      <w:pPr>
+        <w:pStyle w:val="ListParagraph"/>
         <w:numPr>
           <w:ilvl w:val="0"/>
           <w:numId w:val="2"/>
@@ -33443,7 +33517,346 @@
         <w:rPr>
           <w:sz w:val="24"/>
         </w:rPr>
+        <w:lastRenderedPageBreak/>
         <w:t>Implementasikan multi-level authorization untuk semua Level/Jenis User dan Menu- menu yang sesuai dengan Level/Jenis User</w:t>
+      </w:r>
+    </w:p>
+    <w:p>
+      <w:pPr>
+        <w:pStyle w:val="ListParagraph"/>
+        <w:tabs>
+          <w:tab w:val="left" w:pos="866"/>
+          <w:tab w:val="left" w:pos="868"/>
+        </w:tabs>
+        <w:spacing w:before="79" w:line="314" w:lineRule="auto"/>
+        <w:ind w:left="868" w:right="119" w:firstLine="0"/>
+        <w:rPr>
+          <w:sz w:val="24"/>
+        </w:rPr>
+      </w:pPr>
+      <w:r>
+        <w:rPr>
+          <w:sz w:val="24"/>
+        </w:rPr>
+        <w:drawing>
+          <wp:inline distT="0" distB="0" distL="0" distR="0" wp14:anchorId="1E6F38DD" wp14:editId="15A09623">
+            <wp:extent cx="4038600" cy="2107752"/>
+            <wp:effectExtent l="0" t="0" r="0" b="6985"/>
+            <wp:docPr id="95" name="Picture 95"/>
+            <wp:cNvGraphicFramePr>
+              <a:graphicFrameLocks xmlns:a="http://schemas.openxmlformats.org/drawingml/2006/main" noChangeAspect="1"/>
+            </wp:cNvGraphicFramePr>
+            <a:graphic xmlns:a="http://schemas.openxmlformats.org/drawingml/2006/main">
+              <a:graphicData uri="http://schemas.openxmlformats.org/drawingml/2006/picture">
+                <pic:pic xmlns:pic="http://schemas.openxmlformats.org/drawingml/2006/picture">
+                  <pic:nvPicPr>
+                    <pic:cNvPr id="0" name=""/>
+                    <pic:cNvPicPr/>
+                  </pic:nvPicPr>
+                  <pic:blipFill>
+                    <a:blip r:embed="rId50"/>
+                    <a:stretch>
+                      <a:fillRect/>
+                    </a:stretch>
+                  </pic:blipFill>
+                  <pic:spPr>
+                    <a:xfrm>
+                      <a:off x="0" y="0"/>
+                      <a:ext cx="4038600" cy="2107752"/>
+                    </a:xfrm>
+                    <a:prstGeom prst="rect">
+                      <a:avLst/>
+                    </a:prstGeom>
+                  </pic:spPr>
+                </pic:pic>
+              </a:graphicData>
+            </a:graphic>
+          </wp:inline>
+        </w:drawing>
+      </w:r>
+    </w:p>
+    <w:p>
+      <w:pPr>
+        <w:pStyle w:val="ListParagraph"/>
+        <w:tabs>
+          <w:tab w:val="left" w:pos="866"/>
+          <w:tab w:val="left" w:pos="868"/>
+        </w:tabs>
+        <w:spacing w:before="79" w:line="314" w:lineRule="auto"/>
+        <w:ind w:left="868" w:right="119" w:firstLine="0"/>
+        <w:rPr>
+          <w:sz w:val="24"/>
+        </w:rPr>
+      </w:pPr>
+      <w:r>
+        <w:rPr>
+          <w:sz w:val="24"/>
+        </w:rPr>
+        <w:drawing>
+          <wp:inline distT="0" distB="0" distL="0" distR="0" wp14:anchorId="785D066B" wp14:editId="52197096">
+            <wp:extent cx="4038600" cy="2081000"/>
+            <wp:effectExtent l="0" t="0" r="0" b="0"/>
+            <wp:docPr id="96" name="Picture 96"/>
+            <wp:cNvGraphicFramePr>
+              <a:graphicFrameLocks xmlns:a="http://schemas.openxmlformats.org/drawingml/2006/main" noChangeAspect="1"/>
+            </wp:cNvGraphicFramePr>
+            <a:graphic xmlns:a="http://schemas.openxmlformats.org/drawingml/2006/main">
+              <a:graphicData uri="http://schemas.openxmlformats.org/drawingml/2006/picture">
+                <pic:pic xmlns:pic="http://schemas.openxmlformats.org/drawingml/2006/picture">
+                  <pic:nvPicPr>
+                    <pic:cNvPr id="0" name=""/>
+                    <pic:cNvPicPr/>
+                  </pic:nvPicPr>
+                  <pic:blipFill>
+                    <a:blip r:embed="rId51"/>
+                    <a:stretch>
+                      <a:fillRect/>
+                    </a:stretch>
+                  </pic:blipFill>
+                  <pic:spPr>
+                    <a:xfrm>
+                      <a:off x="0" y="0"/>
+                      <a:ext cx="4043325" cy="2083435"/>
+                    </a:xfrm>
+                    <a:prstGeom prst="rect">
+                      <a:avLst/>
+                    </a:prstGeom>
+                  </pic:spPr>
+                </pic:pic>
+              </a:graphicData>
+            </a:graphic>
+          </wp:inline>
+        </w:drawing>
+      </w:r>
+    </w:p>
+    <w:p>
+      <w:pPr>
+        <w:pStyle w:val="ListParagraph"/>
+        <w:tabs>
+          <w:tab w:val="left" w:pos="866"/>
+          <w:tab w:val="left" w:pos="868"/>
+        </w:tabs>
+        <w:spacing w:before="79" w:line="314" w:lineRule="auto"/>
+        <w:ind w:left="868" w:right="119" w:firstLine="0"/>
+        <w:rPr>
+          <w:sz w:val="24"/>
+        </w:rPr>
+      </w:pPr>
+      <w:r>
+        <w:rPr>
+          <w:sz w:val="24"/>
+        </w:rPr>
+        <w:drawing>
+          <wp:inline distT="0" distB="0" distL="0" distR="0" wp14:anchorId="77EDE505" wp14:editId="1C6C8C59">
+            <wp:extent cx="4038600" cy="2051229"/>
+            <wp:effectExtent l="0" t="0" r="0" b="6350"/>
+            <wp:docPr id="97" name="Picture 97"/>
+            <wp:cNvGraphicFramePr>
+              <a:graphicFrameLocks xmlns:a="http://schemas.openxmlformats.org/drawingml/2006/main" noChangeAspect="1"/>
+            </wp:cNvGraphicFramePr>
+            <a:graphic xmlns:a="http://schemas.openxmlformats.org/drawingml/2006/main">
+              <a:graphicData uri="http://schemas.openxmlformats.org/drawingml/2006/picture">
+                <pic:pic xmlns:pic="http://schemas.openxmlformats.org/drawingml/2006/picture">
+                  <pic:nvPicPr>
+                    <pic:cNvPr id="0" name=""/>
+                    <pic:cNvPicPr/>
+                  </pic:nvPicPr>
+                  <pic:blipFill>
+                    <a:blip r:embed="rId52"/>
+                    <a:stretch>
+                      <a:fillRect/>
+                    </a:stretch>
+                  </pic:blipFill>
+                  <pic:spPr>
+                    <a:xfrm>
+                      <a:off x="0" y="0"/>
+                      <a:ext cx="4038600" cy="2051229"/>
+                    </a:xfrm>
+                    <a:prstGeom prst="rect">
+                      <a:avLst/>
+                    </a:prstGeom>
+                  </pic:spPr>
+                </pic:pic>
+              </a:graphicData>
+            </a:graphic>
+          </wp:inline>
+        </w:drawing>
+      </w:r>
+    </w:p>
+    <w:p>
+      <w:pPr>
+        <w:rPr>
+          <w:sz w:val="24"/>
+        </w:rPr>
+      </w:pPr>
+      <w:r>
+        <w:rPr>
+          <w:sz w:val="24"/>
+        </w:rPr>
+        <w:br w:type="page"/>
+      </w:r>
+    </w:p>
+    <w:p>
+      <w:pPr>
+        <w:pStyle w:val="ListParagraph"/>
+        <w:tabs>
+          <w:tab w:val="left" w:pos="866"/>
+          <w:tab w:val="left" w:pos="868"/>
+        </w:tabs>
+        <w:spacing w:before="79" w:line="314" w:lineRule="auto"/>
+        <w:ind w:left="868" w:right="119" w:firstLine="0"/>
+        <w:rPr>
+          <w:sz w:val="24"/>
+        </w:rPr>
+      </w:pPr>
+      <w:r>
+        <w:rPr>
+          <w:sz w:val="24"/>
+        </w:rPr>
+        <w:lastRenderedPageBreak/>
+        <w:drawing>
+          <wp:inline distT="0" distB="0" distL="0" distR="0" wp14:anchorId="30506554" wp14:editId="64413937">
+            <wp:extent cx="4097557" cy="2124075"/>
+            <wp:effectExtent l="0" t="0" r="0" b="0"/>
+            <wp:docPr id="98" name="Picture 98"/>
+            <wp:cNvGraphicFramePr>
+              <a:graphicFrameLocks xmlns:a="http://schemas.openxmlformats.org/drawingml/2006/main" noChangeAspect="1"/>
+            </wp:cNvGraphicFramePr>
+            <a:graphic xmlns:a="http://schemas.openxmlformats.org/drawingml/2006/main">
+              <a:graphicData uri="http://schemas.openxmlformats.org/drawingml/2006/picture">
+                <pic:pic xmlns:pic="http://schemas.openxmlformats.org/drawingml/2006/picture">
+                  <pic:nvPicPr>
+                    <pic:cNvPr id="0" name=""/>
+                    <pic:cNvPicPr/>
+                  </pic:nvPicPr>
+                  <pic:blipFill>
+                    <a:blip r:embed="rId53"/>
+                    <a:stretch>
+                      <a:fillRect/>
+                    </a:stretch>
+                  </pic:blipFill>
+                  <pic:spPr>
+                    <a:xfrm>
+                      <a:off x="0" y="0"/>
+                      <a:ext cx="4112815" cy="2131985"/>
+                    </a:xfrm>
+                    <a:prstGeom prst="rect">
+                      <a:avLst/>
+                    </a:prstGeom>
+                  </pic:spPr>
+                </pic:pic>
+              </a:graphicData>
+            </a:graphic>
+          </wp:inline>
+        </w:drawing>
+      </w:r>
+    </w:p>
+    <w:p>
+      <w:pPr>
+        <w:pStyle w:val="ListParagraph"/>
+        <w:tabs>
+          <w:tab w:val="left" w:pos="866"/>
+          <w:tab w:val="left" w:pos="868"/>
+        </w:tabs>
+        <w:spacing w:before="79" w:line="314" w:lineRule="auto"/>
+        <w:ind w:left="868" w:right="119" w:firstLine="0"/>
+        <w:rPr>
+          <w:sz w:val="24"/>
+        </w:rPr>
+      </w:pPr>
+      <w:r>
+        <w:rPr>
+          <w:sz w:val="24"/>
+        </w:rPr>
+        <w:drawing>
+          <wp:inline distT="0" distB="0" distL="0" distR="0" wp14:anchorId="5552805D" wp14:editId="1524EC4F">
+            <wp:extent cx="4095750" cy="2086820"/>
+            <wp:effectExtent l="0" t="0" r="0" b="8890"/>
+            <wp:docPr id="99" name="Picture 99"/>
+            <wp:cNvGraphicFramePr>
+              <a:graphicFrameLocks xmlns:a="http://schemas.openxmlformats.org/drawingml/2006/main" noChangeAspect="1"/>
+            </wp:cNvGraphicFramePr>
+            <a:graphic xmlns:a="http://schemas.openxmlformats.org/drawingml/2006/main">
+              <a:graphicData uri="http://schemas.openxmlformats.org/drawingml/2006/picture">
+                <pic:pic xmlns:pic="http://schemas.openxmlformats.org/drawingml/2006/picture">
+                  <pic:nvPicPr>
+                    <pic:cNvPr id="0" name=""/>
+                    <pic:cNvPicPr/>
+                  </pic:nvPicPr>
+                  <pic:blipFill>
+                    <a:blip r:embed="rId54"/>
+                    <a:stretch>
+                      <a:fillRect/>
+                    </a:stretch>
+                  </pic:blipFill>
+                  <pic:spPr>
+                    <a:xfrm>
+                      <a:off x="0" y="0"/>
+                      <a:ext cx="4100240" cy="2089108"/>
+                    </a:xfrm>
+                    <a:prstGeom prst="rect">
+                      <a:avLst/>
+                    </a:prstGeom>
+                  </pic:spPr>
+                </pic:pic>
+              </a:graphicData>
+            </a:graphic>
+          </wp:inline>
+        </w:drawing>
+      </w:r>
+    </w:p>
+    <w:p>
+      <w:pPr>
+        <w:pStyle w:val="ListParagraph"/>
+        <w:tabs>
+          <w:tab w:val="left" w:pos="866"/>
+          <w:tab w:val="left" w:pos="868"/>
+        </w:tabs>
+        <w:spacing w:before="79" w:line="314" w:lineRule="auto"/>
+        <w:ind w:left="868" w:right="119" w:firstLine="0"/>
+        <w:rPr>
+          <w:sz w:val="24"/>
+        </w:rPr>
+      </w:pPr>
+      <w:r>
+        <w:rPr>
+          <w:sz w:val="24"/>
+        </w:rPr>
+        <w:drawing>
+          <wp:inline distT="0" distB="0" distL="0" distR="0" wp14:anchorId="294BA21D" wp14:editId="085E8ABD">
+            <wp:extent cx="4070195" cy="2085975"/>
+            <wp:effectExtent l="0" t="0" r="6985" b="0"/>
+            <wp:docPr id="100" name="Picture 100"/>
+            <wp:cNvGraphicFramePr>
+              <a:graphicFrameLocks xmlns:a="http://schemas.openxmlformats.org/drawingml/2006/main" noChangeAspect="1"/>
+            </wp:cNvGraphicFramePr>
+            <a:graphic xmlns:a="http://schemas.openxmlformats.org/drawingml/2006/main">
+              <a:graphicData uri="http://schemas.openxmlformats.org/drawingml/2006/picture">
+                <pic:pic xmlns:pic="http://schemas.openxmlformats.org/drawingml/2006/picture">
+                  <pic:nvPicPr>
+                    <pic:cNvPr id="0" name=""/>
+                    <pic:cNvPicPr/>
+                  </pic:nvPicPr>
+                  <pic:blipFill>
+                    <a:blip r:embed="rId55"/>
+                    <a:stretch>
+                      <a:fillRect/>
+                    </a:stretch>
+                  </pic:blipFill>
+                  <pic:spPr>
+                    <a:xfrm>
+                      <a:off x="0" y="0"/>
+                      <a:ext cx="4070195" cy="2085975"/>
+                    </a:xfrm>
+                    <a:prstGeom prst="rect">
+                      <a:avLst/>
+                    </a:prstGeom>
+                  </pic:spPr>
+                </pic:pic>
+              </a:graphicData>
+            </a:graphic>
+          </wp:inline>
+        </w:drawing>
       </w:r>
     </w:p>
     <w:p>
@@ -33584,10 +33997,22 @@
     </w:p>
     <w:p>
       <w:pPr>
-        <w:pStyle w:val="BodyText"/>
-        <w:spacing w:before="195"/>
         <w:rPr>
           <w:sz w:val="20"/>
+        </w:rPr>
+      </w:pPr>
+      <w:r>
+        <w:rPr>
+          <w:sz w:val="20"/>
+        </w:rPr>
+        <w:br w:type="page"/>
+      </w:r>
+    </w:p>
+    <w:p>
+      <w:pPr>
+        <w:rPr>
+          <w:sz w:val="20"/>
+          <w:szCs w:val="24"/>
         </w:rPr>
       </w:pPr>
       <w:r>
@@ -33595,10 +34020,11 @@
           <w:noProof/>
           <w:sz w:val="20"/>
         </w:rPr>
+        <w:lastRenderedPageBreak/>
         <mc:AlternateContent>
           <mc:Choice Requires="wpg">
             <w:drawing>
-              <wp:anchor distT="0" distB="0" distL="0" distR="0" simplePos="0" relativeHeight="487602176" behindDoc="1" locked="0" layoutInCell="1" allowOverlap="1">
+              <wp:anchor distT="0" distB="0" distL="0" distR="0" simplePos="0" relativeHeight="487602176" behindDoc="1" locked="0" layoutInCell="1" allowOverlap="1" wp14:anchorId="71E4DDBC" wp14:editId="741B6E9A">
                 <wp:simplePos x="0" y="0"/>
                 <wp:positionH relativeFrom="page">
                   <wp:posOffset>883475</wp:posOffset>
@@ -34063,6 +34489,457 @@
     <w:p>
       <w:pPr>
         <w:pStyle w:val="ListParagraph"/>
+        <w:tabs>
+          <w:tab w:val="left" w:pos="867"/>
+        </w:tabs>
+        <w:spacing w:before="124"/>
+        <w:ind w:left="867" w:firstLine="0"/>
+        <w:rPr>
+          <w:spacing w:val="-4"/>
+          <w:sz w:val="24"/>
+        </w:rPr>
+      </w:pPr>
+      <w:r>
+        <w:rPr>
+          <w:spacing w:val="-4"/>
+          <w:sz w:val="24"/>
+        </w:rPr>
+        <w:t>Kode :</w:t>
+      </w:r>
+    </w:p>
+    <w:p>
+      <w:pPr>
+        <w:pStyle w:val="ListParagraph"/>
+        <w:tabs>
+          <w:tab w:val="left" w:pos="867"/>
+        </w:tabs>
+        <w:spacing w:before="124"/>
+        <w:ind w:left="867" w:firstLine="0"/>
+        <w:rPr>
+          <w:spacing w:val="-4"/>
+          <w:sz w:val="24"/>
+        </w:rPr>
+      </w:pPr>
+      <w:r>
+        <w:rPr>
+          <w:spacing w:val="-4"/>
+          <w:sz w:val="24"/>
+        </w:rPr>
+        <w:t>Buat file view register.blade.php</w:t>
+      </w:r>
+    </w:p>
+    <w:p>
+      <w:pPr>
+        <w:pStyle w:val="ListParagraph"/>
+        <w:tabs>
+          <w:tab w:val="left" w:pos="867"/>
+        </w:tabs>
+        <w:spacing w:before="124"/>
+        <w:ind w:left="867" w:firstLine="0"/>
+        <w:rPr>
+          <w:sz w:val="24"/>
+        </w:rPr>
+      </w:pPr>
+      <w:r>
+        <w:rPr>
+          <w:sz w:val="24"/>
+        </w:rPr>
+        <w:drawing>
+          <wp:inline distT="0" distB="0" distL="0" distR="0" wp14:anchorId="78B0EAEC" wp14:editId="20B89AA9">
+            <wp:extent cx="4171950" cy="2211223"/>
+            <wp:effectExtent l="0" t="0" r="0" b="0"/>
+            <wp:docPr id="103" name="Picture 103"/>
+            <wp:cNvGraphicFramePr>
+              <a:graphicFrameLocks xmlns:a="http://schemas.openxmlformats.org/drawingml/2006/main" noChangeAspect="1"/>
+            </wp:cNvGraphicFramePr>
+            <a:graphic xmlns:a="http://schemas.openxmlformats.org/drawingml/2006/main">
+              <a:graphicData uri="http://schemas.openxmlformats.org/drawingml/2006/picture">
+                <pic:pic xmlns:pic="http://schemas.openxmlformats.org/drawingml/2006/picture">
+                  <pic:nvPicPr>
+                    <pic:cNvPr id="0" name=""/>
+                    <pic:cNvPicPr/>
+                  </pic:nvPicPr>
+                  <pic:blipFill>
+                    <a:blip r:embed="rId56"/>
+                    <a:stretch>
+                      <a:fillRect/>
+                    </a:stretch>
+                  </pic:blipFill>
+                  <pic:spPr>
+                    <a:xfrm>
+                      <a:off x="0" y="0"/>
+                      <a:ext cx="4171950" cy="2211223"/>
+                    </a:xfrm>
+                    <a:prstGeom prst="rect">
+                      <a:avLst/>
+                    </a:prstGeom>
+                  </pic:spPr>
+                </pic:pic>
+              </a:graphicData>
+            </a:graphic>
+          </wp:inline>
+        </w:drawing>
+      </w:r>
+    </w:p>
+    <w:p>
+      <w:pPr>
+        <w:pStyle w:val="ListParagraph"/>
+        <w:tabs>
+          <w:tab w:val="left" w:pos="867"/>
+        </w:tabs>
+        <w:spacing w:before="124"/>
+        <w:ind w:left="867" w:firstLine="0"/>
+        <w:rPr>
+          <w:sz w:val="24"/>
+        </w:rPr>
+      </w:pPr>
+      <w:r>
+        <w:rPr>
+          <w:sz w:val="24"/>
+        </w:rPr>
+        <w:t>Bikin fungsi di AuthController</w:t>
+      </w:r>
+    </w:p>
+    <w:p>
+      <w:pPr>
+        <w:pStyle w:val="ListParagraph"/>
+        <w:tabs>
+          <w:tab w:val="left" w:pos="867"/>
+        </w:tabs>
+        <w:spacing w:before="124"/>
+        <w:ind w:left="867" w:firstLine="0"/>
+        <w:rPr>
+          <w:sz w:val="24"/>
+        </w:rPr>
+      </w:pPr>
+      <w:r>
+        <w:rPr>
+          <w:sz w:val="24"/>
+        </w:rPr>
+        <w:drawing>
+          <wp:inline distT="0" distB="0" distL="0" distR="0" wp14:anchorId="1E1046BB" wp14:editId="53F3FF41">
+            <wp:extent cx="4114800" cy="2686489"/>
+            <wp:effectExtent l="0" t="0" r="0" b="0"/>
+            <wp:docPr id="104" name="Picture 104"/>
+            <wp:cNvGraphicFramePr>
+              <a:graphicFrameLocks xmlns:a="http://schemas.openxmlformats.org/drawingml/2006/main" noChangeAspect="1"/>
+            </wp:cNvGraphicFramePr>
+            <a:graphic xmlns:a="http://schemas.openxmlformats.org/drawingml/2006/main">
+              <a:graphicData uri="http://schemas.openxmlformats.org/drawingml/2006/picture">
+                <pic:pic xmlns:pic="http://schemas.openxmlformats.org/drawingml/2006/picture">
+                  <pic:nvPicPr>
+                    <pic:cNvPr id="0" name=""/>
+                    <pic:cNvPicPr/>
+                  </pic:nvPicPr>
+                  <pic:blipFill>
+                    <a:blip r:embed="rId57"/>
+                    <a:stretch>
+                      <a:fillRect/>
+                    </a:stretch>
+                  </pic:blipFill>
+                  <pic:spPr>
+                    <a:xfrm>
+                      <a:off x="0" y="0"/>
+                      <a:ext cx="4125369" cy="2693390"/>
+                    </a:xfrm>
+                    <a:prstGeom prst="rect">
+                      <a:avLst/>
+                    </a:prstGeom>
+                  </pic:spPr>
+                </pic:pic>
+              </a:graphicData>
+            </a:graphic>
+          </wp:inline>
+        </w:drawing>
+      </w:r>
+    </w:p>
+    <w:p>
+      <w:pPr>
+        <w:rPr>
+          <w:sz w:val="24"/>
+        </w:rPr>
+      </w:pPr>
+      <w:r>
+        <w:rPr>
+          <w:sz w:val="24"/>
+        </w:rPr>
+        <w:br w:type="page"/>
+      </w:r>
+    </w:p>
+    <w:p>
+      <w:pPr>
+        <w:pStyle w:val="ListParagraph"/>
+        <w:tabs>
+          <w:tab w:val="left" w:pos="867"/>
+        </w:tabs>
+        <w:spacing w:before="124"/>
+        <w:ind w:left="867" w:firstLine="0"/>
+        <w:rPr>
+          <w:sz w:val="24"/>
+        </w:rPr>
+      </w:pPr>
+      <w:r>
+        <w:rPr>
+          <w:sz w:val="24"/>
+        </w:rPr>
+        <w:lastRenderedPageBreak/>
+        <w:t>Tambahkan form untuk menampilkan di login dan bisa menuju laman registrasi</w:t>
+      </w:r>
+    </w:p>
+    <w:p>
+      <w:pPr>
+        <w:pStyle w:val="ListParagraph"/>
+        <w:tabs>
+          <w:tab w:val="left" w:pos="867"/>
+        </w:tabs>
+        <w:spacing w:before="124"/>
+        <w:ind w:left="867" w:firstLine="0"/>
+        <w:rPr>
+          <w:sz w:val="24"/>
+        </w:rPr>
+      </w:pPr>
+      <w:r>
+        <w:rPr>
+          <w:sz w:val="24"/>
+        </w:rPr>
+        <w:drawing>
+          <wp:inline distT="0" distB="0" distL="0" distR="0" wp14:anchorId="4B35012B" wp14:editId="3AA653A9">
+            <wp:extent cx="4324350" cy="653273"/>
+            <wp:effectExtent l="0" t="0" r="0" b="0"/>
+            <wp:docPr id="105" name="Picture 105"/>
+            <wp:cNvGraphicFramePr>
+              <a:graphicFrameLocks xmlns:a="http://schemas.openxmlformats.org/drawingml/2006/main" noChangeAspect="1"/>
+            </wp:cNvGraphicFramePr>
+            <a:graphic xmlns:a="http://schemas.openxmlformats.org/drawingml/2006/main">
+              <a:graphicData uri="http://schemas.openxmlformats.org/drawingml/2006/picture">
+                <pic:pic xmlns:pic="http://schemas.openxmlformats.org/drawingml/2006/picture">
+                  <pic:nvPicPr>
+                    <pic:cNvPr id="0" name=""/>
+                    <pic:cNvPicPr/>
+                  </pic:nvPicPr>
+                  <pic:blipFill>
+                    <a:blip r:embed="rId58"/>
+                    <a:stretch>
+                      <a:fillRect/>
+                    </a:stretch>
+                  </pic:blipFill>
+                  <pic:spPr>
+                    <a:xfrm>
+                      <a:off x="0" y="0"/>
+                      <a:ext cx="4336618" cy="655126"/>
+                    </a:xfrm>
+                    <a:prstGeom prst="rect">
+                      <a:avLst/>
+                    </a:prstGeom>
+                  </pic:spPr>
+                </pic:pic>
+              </a:graphicData>
+            </a:graphic>
+          </wp:inline>
+        </w:drawing>
+      </w:r>
+    </w:p>
+    <w:p>
+      <w:pPr>
+        <w:pStyle w:val="ListParagraph"/>
+        <w:tabs>
+          <w:tab w:val="left" w:pos="867"/>
+        </w:tabs>
+        <w:spacing w:before="124"/>
+        <w:ind w:left="867" w:firstLine="0"/>
+        <w:rPr>
+          <w:sz w:val="24"/>
+        </w:rPr>
+      </w:pPr>
+      <w:r>
+        <w:rPr>
+          <w:sz w:val="24"/>
+        </w:rPr>
+        <w:t>Tambahkan route</w:t>
+      </w:r>
+    </w:p>
+    <w:p>
+      <w:pPr>
+        <w:pStyle w:val="ListParagraph"/>
+        <w:tabs>
+          <w:tab w:val="left" w:pos="867"/>
+        </w:tabs>
+        <w:spacing w:before="124"/>
+        <w:ind w:left="867" w:firstLine="0"/>
+        <w:rPr>
+          <w:sz w:val="24"/>
+        </w:rPr>
+      </w:pPr>
+      <w:r>
+        <w:rPr>
+          <w:sz w:val="24"/>
+        </w:rPr>
+        <w:drawing>
+          <wp:inline distT="0" distB="0" distL="0" distR="0" wp14:anchorId="6802CE7C" wp14:editId="1025F3E5">
+            <wp:extent cx="4324350" cy="518830"/>
+            <wp:effectExtent l="0" t="0" r="0" b="0"/>
+            <wp:docPr id="106" name="Picture 106"/>
+            <wp:cNvGraphicFramePr>
+              <a:graphicFrameLocks xmlns:a="http://schemas.openxmlformats.org/drawingml/2006/main" noChangeAspect="1"/>
+            </wp:cNvGraphicFramePr>
+            <a:graphic xmlns:a="http://schemas.openxmlformats.org/drawingml/2006/main">
+              <a:graphicData uri="http://schemas.openxmlformats.org/drawingml/2006/picture">
+                <pic:pic xmlns:pic="http://schemas.openxmlformats.org/drawingml/2006/picture">
+                  <pic:nvPicPr>
+                    <pic:cNvPr id="0" name=""/>
+                    <pic:cNvPicPr/>
+                  </pic:nvPicPr>
+                  <pic:blipFill>
+                    <a:blip r:embed="rId59"/>
+                    <a:stretch>
+                      <a:fillRect/>
+                    </a:stretch>
+                  </pic:blipFill>
+                  <pic:spPr>
+                    <a:xfrm>
+                      <a:off x="0" y="0"/>
+                      <a:ext cx="4324350" cy="518830"/>
+                    </a:xfrm>
+                    <a:prstGeom prst="rect">
+                      <a:avLst/>
+                    </a:prstGeom>
+                  </pic:spPr>
+                </pic:pic>
+              </a:graphicData>
+            </a:graphic>
+          </wp:inline>
+        </w:drawing>
+      </w:r>
+    </w:p>
+    <w:p>
+      <w:pPr>
+        <w:pStyle w:val="ListParagraph"/>
+        <w:tabs>
+          <w:tab w:val="left" w:pos="867"/>
+        </w:tabs>
+        <w:spacing w:before="124"/>
+        <w:ind w:left="867" w:firstLine="0"/>
+        <w:rPr>
+          <w:sz w:val="24"/>
+        </w:rPr>
+      </w:pPr>
+      <w:r>
+        <w:rPr>
+          <w:spacing w:val="-4"/>
+          <w:sz w:val="24"/>
+        </w:rPr>
+        <w:t>Hasil :</w:t>
+      </w:r>
+    </w:p>
+    <w:p>
+      <w:pPr>
+        <w:pStyle w:val="ListParagraph"/>
+        <w:tabs>
+          <w:tab w:val="left" w:pos="867"/>
+        </w:tabs>
+        <w:spacing w:before="124"/>
+        <w:ind w:left="867" w:firstLine="0"/>
+        <w:rPr>
+          <w:sz w:val="24"/>
+        </w:rPr>
+      </w:pPr>
+      <w:r>
+        <w:rPr>
+          <w:noProof/>
+        </w:rPr>
+        <w:drawing>
+          <wp:inline distT="0" distB="0" distL="0" distR="0" wp14:anchorId="172B8847" wp14:editId="3A27DCAA">
+            <wp:extent cx="3914775" cy="2200807"/>
+            <wp:effectExtent l="0" t="0" r="0" b="9525"/>
+            <wp:docPr id="101" name="Picture 101"/>
+            <wp:cNvGraphicFramePr>
+              <a:graphicFrameLocks xmlns:a="http://schemas.openxmlformats.org/drawingml/2006/main" noChangeAspect="1"/>
+            </wp:cNvGraphicFramePr>
+            <a:graphic xmlns:a="http://schemas.openxmlformats.org/drawingml/2006/main">
+              <a:graphicData uri="http://schemas.openxmlformats.org/drawingml/2006/picture">
+                <pic:pic xmlns:pic="http://schemas.openxmlformats.org/drawingml/2006/picture">
+                  <pic:nvPicPr>
+                    <pic:cNvPr id="0" name=""/>
+                    <pic:cNvPicPr/>
+                  </pic:nvPicPr>
+                  <pic:blipFill>
+                    <a:blip r:embed="rId60"/>
+                    <a:stretch>
+                      <a:fillRect/>
+                    </a:stretch>
+                  </pic:blipFill>
+                  <pic:spPr>
+                    <a:xfrm>
+                      <a:off x="0" y="0"/>
+                      <a:ext cx="3917764" cy="2202487"/>
+                    </a:xfrm>
+                    <a:prstGeom prst="rect">
+                      <a:avLst/>
+                    </a:prstGeom>
+                  </pic:spPr>
+                </pic:pic>
+              </a:graphicData>
+            </a:graphic>
+          </wp:inline>
+        </w:drawing>
+      </w:r>
+    </w:p>
+    <w:p>
+      <w:pPr>
+        <w:pStyle w:val="ListParagraph"/>
+        <w:tabs>
+          <w:tab w:val="left" w:pos="867"/>
+        </w:tabs>
+        <w:spacing w:before="124"/>
+        <w:ind w:left="867" w:firstLine="0"/>
+        <w:rPr>
+          <w:sz w:val="24"/>
+        </w:rPr>
+      </w:pPr>
+      <w:r>
+        <w:rPr>
+          <w:noProof/>
+        </w:rPr>
+        <w:drawing>
+          <wp:inline distT="0" distB="0" distL="0" distR="0" wp14:anchorId="2DB4763C" wp14:editId="567F8EE3">
+            <wp:extent cx="3913830" cy="2200275"/>
+            <wp:effectExtent l="0" t="0" r="0" b="0"/>
+            <wp:docPr id="102" name="Picture 102"/>
+            <wp:cNvGraphicFramePr>
+              <a:graphicFrameLocks xmlns:a="http://schemas.openxmlformats.org/drawingml/2006/main" noChangeAspect="1"/>
+            </wp:cNvGraphicFramePr>
+            <a:graphic xmlns:a="http://schemas.openxmlformats.org/drawingml/2006/main">
+              <a:graphicData uri="http://schemas.openxmlformats.org/drawingml/2006/picture">
+                <pic:pic xmlns:pic="http://schemas.openxmlformats.org/drawingml/2006/picture">
+                  <pic:nvPicPr>
+                    <pic:cNvPr id="0" name=""/>
+                    <pic:cNvPicPr/>
+                  </pic:nvPicPr>
+                  <pic:blipFill>
+                    <a:blip r:embed="rId61"/>
+                    <a:stretch>
+                      <a:fillRect/>
+                    </a:stretch>
+                  </pic:blipFill>
+                  <pic:spPr>
+                    <a:xfrm>
+                      <a:off x="0" y="0"/>
+                      <a:ext cx="3916280" cy="2201652"/>
+                    </a:xfrm>
+                    <a:prstGeom prst="rect">
+                      <a:avLst/>
+                    </a:prstGeom>
+                  </pic:spPr>
+                </pic:pic>
+              </a:graphicData>
+            </a:graphic>
+          </wp:inline>
+        </w:drawing>
+      </w:r>
+    </w:p>
+    <w:p>
+      <w:pPr>
+        <w:pStyle w:val="ListParagraph"/>
         <w:numPr>
           <w:ilvl w:val="0"/>
           <w:numId w:val="1"/>
@@ -34294,6 +35171,8 @@
       <w:pPr>
         <w:pStyle w:val="BodyText"/>
       </w:pPr>
+      <w:bookmarkStart w:id="0" w:name="_GoBack"/>
+      <w:bookmarkEnd w:id="0"/>
     </w:p>
     <w:p>
       <w:pPr>
@@ -34424,7 +35303,7 @@
             </wp:anchor>
           </w:drawing>
         </mc:Choice>
-        <mc:Fallback xmlns:pic="http://schemas.openxmlformats.org/drawingml/2006/picture" xmlns:a="http://schemas.openxmlformats.org/drawingml/2006/main" xmlns:ve="http://schemas.openxmlformats.org/markup-compatibility/2006">
+        <mc:Fallback xmlns:ve="http://schemas.openxmlformats.org/markup-compatibility/2006" xmlns:a="http://schemas.openxmlformats.org/drawingml/2006/main" xmlns:pic="http://schemas.openxmlformats.org/drawingml/2006/picture">
           <w:pict>
             <v:rect style="position:absolute;margin-left:69.565002pt;margin-top:782.045654pt;width:456.73pt;height:.70935pt;mso-position-horizontal-relative:page;mso-position-vertical-relative:page;z-index:-16027648" id="docshape3" filled="true" fillcolor="#000000" stroked="false">
               <v:fill type="solid"/>
@@ -34763,7 +35642,7 @@
                               <w:w w:val="110"/>
                               <w:sz w:val="20"/>
                             </w:rPr>
-                            <w:t>10</w:t>
+                            <w:t>20</w:t>
                           </w:r>
                           <w:r>
                             <w:rPr>
@@ -34834,7 +35713,7 @@
                               <w:w w:val="110"/>
                               <w:sz w:val="20"/>
                             </w:rPr>
-                            <w:t>16</w:t>
+                            <w:t>20</w:t>
                           </w:r>
                           <w:r>
                             <w:rPr>
@@ -34924,7 +35803,7 @@
                         <w:w w:val="110"/>
                         <w:sz w:val="20"/>
                       </w:rPr>
-                      <w:t>10</w:t>
+                      <w:t>20</w:t>
                     </w:r>
                     <w:r>
                       <w:rPr>
@@ -34995,7 +35874,7 @@
                         <w:w w:val="110"/>
                         <w:sz w:val="20"/>
                       </w:rPr>
-                      <w:t>16</w:t>
+                      <w:t>20</w:t>
                     </w:r>
                     <w:r>
                       <w:rPr>
@@ -35210,7 +36089,7 @@
             </wp:anchor>
           </w:drawing>
         </mc:Choice>
-        <mc:Fallback xmlns:pic="http://schemas.openxmlformats.org/drawingml/2006/picture" xmlns:a="http://schemas.openxmlformats.org/drawingml/2006/main" xmlns:ve="http://schemas.openxmlformats.org/markup-compatibility/2006">
+        <mc:Fallback xmlns:ve="http://schemas.openxmlformats.org/markup-compatibility/2006" xmlns:a="http://schemas.openxmlformats.org/drawingml/2006/main" xmlns:pic="http://schemas.openxmlformats.org/drawingml/2006/picture">
           <w:pict>
             <v:shape style="position:absolute;margin-left:70.983002pt;margin-top:119.571976pt;width:453.9pt;height:1.45pt;mso-position-horizontal-relative:page;mso-position-vertical-relative:page;z-index:-16028672" id="docshape1" coordorigin="1420,2391" coordsize="9078,29" path="m3116,2391l1420,2391,1420,2420,3116,2420,3116,2391xm3144,2391l3116,2391,3116,2420,3144,2420,3144,2391xm10498,2391l3144,2391,3144,2420,10498,2420,10498,2391xe" filled="true" fillcolor="#000000" stroked="false">
               <v:path arrowok="t"/>

</xml_diff>